<commit_message>
Reframe the short Preesm entry, bump to 8 years, order tech lines
The short Preesm bullets now describe ownership (design, architecture,
tech choices, infrastructure) and the product modules instead of
onboarding-engine internals. The summary says 8 years of experience,
kouji-ui joins the Preesm stack, and every mission's tech line reads
frontend, backend, data, tests, tooling, then infrastructure.

Claude-Session: https://claude.ai/code/session_01L5bk4rWD9DPaKBHbB2Jhkm
</commit_message>
<xml_diff>
--- a/assets/najih-driss-cv-en-long.docx
+++ b/assets/najih-driss-cv-en-long.docx
@@ -190,7 +190,7 @@
           <w:b/>
           <w:sz w:val="21"/>
         </w:rPr>
-        <w:t xml:space="preserve">7+ years of experience</w:t>
+        <w:t xml:space="preserve">8 years of experience</w:t>
       </w:r>
       <w:r>
         <w:rPr>
@@ -634,7 +634,7 @@
           <w:color w:val="57606a"/>
           <w:sz w:val="20"/>
         </w:rPr>
-        <w:t xml:space="preserve">May 2026 – Present (4 months)</w:t>
+        <w:t xml:space="preserve">May 2026 – Present (5 months)</w:t>
       </w:r>
     </w:p>
     <w:p>
@@ -1128,7 +1128,7 @@
           <w:color w:val="444444"/>
           <w:sz w:val="19"/>
         </w:rPr>
-        <w:t xml:space="preserve"> Angular 22 (zoneless, signals), TypeScript, Tailwind CSS 4, Hono, Node.js, BetterAuth (passkeys, TOTP), PostgreSQL 17, Drizzle ORM, Zod, pdf-lib, nodemailer, S3-compatible storage, Playwright, Vitest, Docker, GitHub Actions, Render, OVH, Caddy, pgBackRest</w:t>
+        <w:t xml:space="preserve"> Angular 22 (zoneless, signals), kouji-ui, TypeScript, Tailwind CSS 4, Node.js, Hono, BetterAuth (passkeys, TOTP), Zod, pdf-lib, nodemailer, PostgreSQL 17, Drizzle ORM, S3-compatible storage, Vitest, Playwright, Docker, GitHub Actions, Render, OVH, Caddy, pgBackRest</w:t>
       </w:r>
     </w:p>
     <w:p>
@@ -1153,7 +1153,7 @@
           <w:color w:val="57606a"/>
           <w:sz w:val="20"/>
         </w:rPr>
-        <w:t xml:space="preserve">September 2023 – Present (3 years)</w:t>
+        <w:t xml:space="preserve">September 2023 – Present (3 years 1 month)</w:t>
       </w:r>
     </w:p>
     <w:p>
@@ -2071,7 +2071,7 @@
           <w:color w:val="444444"/>
           <w:sz w:val="19"/>
         </w:rPr>
-        <w:t xml:space="preserve"> Angular, TypeScript, Node.js, Electron, SQLite, PowerShell, Java 8/11/21, Spring Boot, Quarkus, Keycloak, Oracle DB, MongoDB, Karma, Jest, JaCoCo, Cypress, Playwright, Webpack, Jenkins, GitLab CI, Claude, Codex, Agile Scrum</w:t>
+        <w:t xml:space="preserve"> Angular, TypeScript, Electron, Node.js, Java 8/11/21, Spring Boot, Quarkus, Keycloak, Oracle DB, MongoDB, SQLite, Karma, Jest, Cypress, Playwright, JaCoCo, Webpack, PowerShell, Jenkins, GitLab CI, Claude, Codex, Agile Scrum</w:t>
       </w:r>
     </w:p>
     <w:p>
@@ -2376,7 +2376,7 @@
           <w:color w:val="444444"/>
           <w:sz w:val="19"/>
         </w:rPr>
-        <w:t xml:space="preserve"> Java 17, Spring Boot, Spring Security, OAuth2, PostgreSQL, Quartz, Flyway, JaCoCo, Docker, Kubernetes, RabbitMQ, Jenkins</w:t>
+        <w:t xml:space="preserve"> Java 17, Spring Boot, Spring Security, OAuth2, Quartz, RabbitMQ, PostgreSQL, Flyway, JaCoCo, Docker, Kubernetes, Jenkins</w:t>
       </w:r>
     </w:p>
     <w:p>
@@ -3325,7 +3325,7 @@
           <w:color w:val="444444"/>
           <w:sz w:val="19"/>
         </w:rPr>
-        <w:t xml:space="preserve"> Java 8, Spring Boot, Spring Batch, Spring Security, Angular 12, Ant Design, AG Grid, WebSockets, Azure AD, Keycloak, SQL Server, Azure DevOps, Jenkins</w:t>
+        <w:t xml:space="preserve"> Angular 12, Ant Design, AG Grid, WebSockets, Java 8, Spring Boot, Spring Batch, Spring Security, Keycloak, Azure AD, SQL Server, Azure DevOps, Jenkins</w:t>
       </w:r>
     </w:p>
     <w:p>
@@ -3895,7 +3895,7 @@
           <w:color w:val="444444"/>
           <w:sz w:val="19"/>
         </w:rPr>
-        <w:t xml:space="preserve"> Tauri 2, Rust, Angular 20, TypeScript, CodeMirror 6, Lexical, RxJS, Vitest, Playwright, GitHub Actions</w:t>
+        <w:t xml:space="preserve"> Angular 20, TypeScript, RxJS, CodeMirror 6, Lexical, Tauri 2, Rust, Vitest, Playwright, GitHub Actions</w:t>
       </w:r>
     </w:p>
     <w:p>
@@ -4346,7 +4346,7 @@
           <w:color w:val="444444"/>
           <w:sz w:val="19"/>
         </w:rPr>
-        <w:t xml:space="preserve"> Angular 22 (zoneless), TypeScript, Hono, Node.js, PostgreSQL, Drizzle ORM (RLS), Redis, Zod, Stripe, @kouji-ui, Angular SSR, Playwright, Docker, pnpm, Render</w:t>
+        <w:t xml:space="preserve"> Angular 22 (zoneless), Angular SSR, TypeScript, @kouji-ui, Node.js, Hono, Zod, Stripe, PostgreSQL, Drizzle ORM (RLS), Redis, Playwright, pnpm, Docker, Render</w:t>
       </w:r>
     </w:p>
     <w:p>
@@ -4743,7 +4743,7 @@
           <w:color w:val="444444"/>
           <w:sz w:val="19"/>
         </w:rPr>
-        <w:t xml:space="preserve"> Angular 21, TypeScript, Angular CLI, pnpm workspaces, Turborepo, Vitest, Playwright, axe-core, ESLint, Prettier, Husky, Changesets, Tailwind CSS, GitHub Actions</w:t>
+        <w:t xml:space="preserve"> Angular 21, TypeScript, Tailwind CSS, Vitest, Playwright, axe-core, ESLint, Prettier, Husky, Angular CLI, pnpm workspaces, Turborepo, Changesets, GitHub Actions</w:t>
       </w:r>
     </w:p>
     <w:p>
@@ -5093,7 +5093,7 @@
           <w:color w:val="444444"/>
           <w:sz w:val="19"/>
         </w:rPr>
-        <w:t xml:space="preserve"> Angular 21, TypeScript 5.7+, Python 3.12, FastAPI, PostgreSQL 17, Redis 8, SQLAlchemy 2.0, Lexical, Tailwind CSS 4, Docker, Docker Compose, Poetry, pnpm, WebSockets, JWT, Pydantic, Alembic, Git, GitHub Actions</w:t>
+        <w:t xml:space="preserve"> Angular 21, TypeScript 5.7+, Tailwind CSS 4, Lexical, WebSockets, Python 3.12, FastAPI, Pydantic, JWT, PostgreSQL 17, SQLAlchemy 2.0, Alembic, Redis 8, Poetry, pnpm, Git, Docker, Docker Compose, GitHub Actions</w:t>
       </w:r>
     </w:p>
     <w:p>
@@ -5486,7 +5486,7 @@
           <w:color w:val="444444"/>
           <w:sz w:val="19"/>
         </w:rPr>
-        <w:t xml:space="preserve"> Next.js 13, React 18, TypeScript, Prisma, PostgreSQL, NextAuth.js, Tailwind CSS, Turborepo, Yarn Workspaces, OAuth, Discord API, Git, GitHub Actions</w:t>
+        <w:t xml:space="preserve"> Next.js 13, React 18, TypeScript, Tailwind CSS, NextAuth.js, OAuth, Discord API, PostgreSQL, Prisma, Turborepo, Yarn Workspaces, Git, GitHub Actions</w:t>
       </w:r>
     </w:p>
     <w:p>
@@ -5872,7 +5872,7 @@
           <w:color w:val="444444"/>
           <w:sz w:val="19"/>
         </w:rPr>
-        <w:t xml:space="preserve"> Angular 21, TypeScript, Express.js, Prisma, PostgreSQL, JWT, Passport.js, TanStack Table, Luxon, Tailwind CSS, Docker, pnpm</w:t>
+        <w:t xml:space="preserve"> Angular 21, TypeScript, TanStack Table, Luxon, Tailwind CSS, Express.js, Passport.js, JWT, PostgreSQL, Prisma, pnpm, Docker</w:t>
       </w:r>
     </w:p>
     <w:p>

</xml_diff>

<commit_message>
Add xHarness and xShifu to Amundi, move Preesm to Supabase and Brevo, bump personal projects to Angular 22
Claude-Session: https://claude.ai/code/session_019WFpx4w3CqE2fgNxZJVcG1
</commit_message>
<xml_diff>
--- a/assets/najih-driss-cv-en-long.docx
+++ b/assets/najih-driss-cv-en-long.docx
@@ -634,7 +634,7 @@
           <w:color w:val="57606a"/>
           <w:sz w:val="20"/>
         </w:rPr>
-        <w:t xml:space="preserve">May 2026 – Present (5 months)</w:t>
+        <w:t xml:space="preserve">May 2026 – Present (6 months)</w:t>
       </w:r>
     </w:p>
     <w:p>
@@ -826,50 +826,60 @@
       </w:r>
       <w:r>
         <w:rPr/>
+        <w:t xml:space="preserve">, signed-counterpart storage, and a </w:t>
+      </w:r>
+      <w:r>
+        <w:rPr>
+          <w:b/>
+        </w:rPr>
+        <w:t xml:space="preserve">file hub</w:t>
+      </w:r>
+      <w:r>
+        <w:rPr/>
+        <w:t xml:space="preserve"> on </w:t>
+      </w:r>
+      <w:r>
+        <w:rPr>
+          <w:b/>
+        </w:rPr>
+        <w:t xml:space="preserve">Supabase</w:t>
+      </w:r>
+      <w:r>
+        <w:rPr/>
+        <w:t xml:space="preserve"> with presigned upload/download</w:t>
+      </w:r>
+    </w:p>
+    <w:p>
+      <w:pPr>
+        <w:numPr>
+          <w:ilvl w:val="0"/>
+          <w:numId w:val="2"/>
+        </w:numPr>
+        <w:spacing w:lineRule="auto"/>
+      </w:pPr>
+      <w:r>
+        <w:rPr/>
+        <w:t xml:space="preserve">Delivered </w:t>
+      </w:r>
+      <w:r>
+        <w:rPr>
+          <w:b/>
+        </w:rPr>
+        <w:t xml:space="preserve">transactional mailing</w:t>
+      </w:r>
+      <w:r>
+        <w:rPr/>
         <w:t xml:space="preserve"> with </w:t>
       </w:r>
       <w:r>
         <w:rPr>
           <w:b/>
         </w:rPr>
-        <w:t xml:space="preserve">pdf-lib</w:t>
-      </w:r>
-      <w:r>
-        <w:rPr/>
-        <w:t xml:space="preserve">, signed-counterpart storage, and a </w:t>
-      </w:r>
-      <w:r>
-        <w:rPr>
-          <w:b/>
-        </w:rPr>
-        <w:t xml:space="preserve">file hub</w:t>
-      </w:r>
-      <w:r>
-        <w:rPr/>
-        <w:t xml:space="preserve"> on S3-compatible object storage with presigned upload/download</w:t>
-      </w:r>
-    </w:p>
-    <w:p>
-      <w:pPr>
-        <w:numPr>
-          <w:ilvl w:val="0"/>
-          <w:numId w:val="2"/>
-        </w:numPr>
-        <w:spacing w:lineRule="auto"/>
-      </w:pPr>
-      <w:r>
-        <w:rPr/>
-        <w:t xml:space="preserve">Delivered </w:t>
-      </w:r>
-      <w:r>
-        <w:rPr>
-          <w:b/>
-        </w:rPr>
-        <w:t xml:space="preserve">transactional mailing</w:t>
-      </w:r>
-      <w:r>
-        <w:rPr/>
-        <w:t xml:space="preserve"> over SMTP and an admin panel where staff configure notification recipients per business trigger, without a code change</w:t>
+        <w:t xml:space="preserve">Brevo</w:t>
+      </w:r>
+      <w:r>
+        <w:rPr/>
+        <w:t xml:space="preserve"> and an admin panel where staff configure notification recipients per business trigger, without a code change</w:t>
       </w:r>
     </w:p>
     <w:p>
@@ -1128,7 +1138,7 @@
           <w:color w:val="444444"/>
           <w:sz w:val="19"/>
         </w:rPr>
-        <w:t xml:space="preserve"> Angular 22 (zoneless, signals), kouji-ui, TypeScript, Tailwind CSS 4, Node.js, Hono, BetterAuth (passkeys, TOTP), Zod, pdf-lib, nodemailer, PostgreSQL 17, Drizzle ORM, S3-compatible storage, Vitest, Playwright, Docker, GitHub Actions, Render, OVH, Caddy, pgBackRest</w:t>
+        <w:t xml:space="preserve"> Angular 22 (zoneless, signals), kouji-ui, TypeScript, Tailwind CSS 4, Node.js, Hono, BetterAuth (passkeys, TOTP), Zod, Brevo, PostgreSQL 17, Drizzle ORM, Supabase, Vitest, Playwright, Docker, GitHub Actions, Render, OVH, Caddy, pgBackRest</w:t>
       </w:r>
     </w:p>
     <w:p>
@@ -1153,7 +1163,7 @@
           <w:color w:val="57606a"/>
           <w:sz w:val="20"/>
         </w:rPr>
-        <w:t xml:space="preserve">September 2023 – Present (3 years 1 month)</w:t>
+        <w:t xml:space="preserve">September 2023 – Present (3 years 2 months)</w:t>
       </w:r>
     </w:p>
     <w:p>
@@ -1816,6 +1826,114 @@
       <w:r>
         <w:rPr/>
         <w:t xml:space="preserve"> for developers to bootstrap model access, credentials, MCP configuration and skill bundles, bringing consistency to how AI tooling is adopted across teams</w:t>
+      </w:r>
+    </w:p>
+    <w:p>
+      <w:pPr>
+        <w:numPr>
+          <w:ilvl w:val="0"/>
+          <w:numId w:val="6"/>
+        </w:numPr>
+        <w:spacing w:lineRule="auto"/>
+      </w:pPr>
+      <w:r>
+        <w:rPr/>
+        <w:t xml:space="preserve">Built </w:t>
+      </w:r>
+      <w:r>
+        <w:rPr>
+          <w:b/>
+        </w:rPr>
+        <w:t xml:space="preserve">xHarness</w:t>
+      </w:r>
+      <w:r>
+        <w:rPr/>
+        <w:t xml:space="preserve">, a benchmarking platform comparing </w:t>
+      </w:r>
+      <w:r>
+        <w:rPr>
+          <w:b/>
+        </w:rPr>
+        <w:t xml:space="preserve">coding agents</w:t>
+      </w:r>
+      <w:r>
+        <w:rPr/>
+        <w:t xml:space="preserve"> (Claude Code, Codex, OpenCode) across model tiers (Opus, Sonnet, GPT Sol, GPT Terra) on the public </w:t>
+      </w:r>
+      <w:r>
+        <w:rPr>
+          <w:b/>
+        </w:rPr>
+        <w:t xml:space="preserve">SWE-bench</w:t>
+      </w:r>
+      <w:r>
+        <w:rPr/>
+        <w:t xml:space="preserve"> framework, orchestrating parallel runs in </w:t>
+      </w:r>
+      <w:r>
+        <w:rPr>
+          <w:b/>
+        </w:rPr>
+        <w:t xml:space="preserve">Docker</w:t>
+      </w:r>
+      <w:r>
+        <w:rPr/>
+        <w:t xml:space="preserve"> with a </w:t>
+      </w:r>
+      <w:r>
+        <w:rPr>
+          <w:b/>
+        </w:rPr>
+        <w:t xml:space="preserve">cost and usage dashboard</w:t>
+      </w:r>
+    </w:p>
+    <w:p>
+      <w:pPr>
+        <w:numPr>
+          <w:ilvl w:val="0"/>
+          <w:numId w:val="6"/>
+        </w:numPr>
+        <w:spacing w:lineRule="auto"/>
+      </w:pPr>
+      <w:r>
+        <w:rPr/>
+        <w:t xml:space="preserve">Built </w:t>
+      </w:r>
+      <w:r>
+        <w:rPr>
+          <w:b/>
+        </w:rPr>
+        <w:t xml:space="preserve">xShifu</w:t>
+      </w:r>
+      <w:r>
+        <w:rPr/>
+        <w:t xml:space="preserve">, a </w:t>
+      </w:r>
+      <w:r>
+        <w:rPr>
+          <w:b/>
+        </w:rPr>
+        <w:t xml:space="preserve">session analytics tool</w:t>
+      </w:r>
+      <w:r>
+        <w:rPr/>
+        <w:t xml:space="preserve"> that analyses developers' local </w:t>
+      </w:r>
+      <w:r>
+        <w:rPr>
+          <w:b/>
+        </w:rPr>
+        <w:t xml:space="preserve">Claude Code and Codex sessions</w:t>
+      </w:r>
+      <w:r>
+        <w:rPr/>
+        <w:t xml:space="preserve"> to surface how they use coding agents, flag wasteful habits and give </w:t>
+      </w:r>
+      <w:r>
+        <w:rPr>
+          <w:b/>
+        </w:rPr>
+        <w:t xml:space="preserve">actionable recommendations to cut token consumption</w:t>
       </w:r>
     </w:p>
     <w:p>
@@ -3543,7 +3661,7 @@
           <w:b/>
           <w:sz w:val="21"/>
         </w:rPr>
-        <w:t xml:space="preserve">Tauri (Rust) and Angular 20</w:t>
+        <w:t xml:space="preserve">Tauri (Rust) and Angular 22</w:t>
       </w:r>
       <w:r>
         <w:rPr>
@@ -3604,7 +3722,7 @@
         <w:rPr>
           <w:b/>
         </w:rPr>
-        <w:t xml:space="preserve">Angular 20</w:t>
+        <w:t xml:space="preserve">Angular 22</w:t>
       </w:r>
       <w:r>
         <w:rPr/>
@@ -3895,7 +4013,7 @@
           <w:color w:val="444444"/>
           <w:sz w:val="19"/>
         </w:rPr>
-        <w:t xml:space="preserve"> Angular 20, TypeScript, RxJS, CodeMirror 6, Lexical, Tauri 2, Rust, Vitest, Playwright, GitHub Actions</w:t>
+        <w:t xml:space="preserve"> Angular 22, TypeScript, RxJS, CodeMirror 6, Lexical, Tauri 2, Rust, Vitest, Playwright, GitHub Actions</w:t>
       </w:r>
     </w:p>
     <w:p>
@@ -4443,7 +4561,7 @@
           <w:b/>
           <w:sz w:val="21"/>
         </w:rPr>
-        <w:t xml:space="preserve">Angular 21</w:t>
+        <w:t xml:space="preserve">Angular 22</w:t>
       </w:r>
       <w:r>
         <w:rPr>
@@ -4547,7 +4665,7 @@
         <w:rPr>
           <w:b/>
         </w:rPr>
-        <w:t xml:space="preserve">60+ standalone Angular 21 components</w:t>
+        <w:t xml:space="preserve">60+ standalone Angular 22 components</w:t>
       </w:r>
       <w:r>
         <w:rPr/>
@@ -4743,7 +4861,7 @@
           <w:color w:val="444444"/>
           <w:sz w:val="19"/>
         </w:rPr>
-        <w:t xml:space="preserve"> Angular 21, TypeScript, Tailwind CSS, Vitest, Playwright, axe-core, ESLint, Prettier, Husky, Angular CLI, pnpm workspaces, Turborepo, Changesets, GitHub Actions</w:t>
+        <w:t xml:space="preserve"> Angular 22, TypeScript, Tailwind CSS, Vitest, Playwright, axe-core, ESLint, Prettier, Husky, Angular CLI, pnpm workspaces, Turborepo, Changesets, GitHub Actions</w:t>
       </w:r>
     </w:p>
     <w:p>

</xml_diff>